<commit_message>
feat(template): rende il template fattura generico con placeholder docxtpl
Sostituisce i dati personali hardcoded nel template DOCX con variabili
docxtpl (intestatario_*) lette da env vars. Aggiunge supporto per template
custom montato via volume Docker (custom_template/) con fallback al
template generico built-in.

Co-Authored-By: Claude Opus 4.6 <noreply@anthropic.com>
</commit_message>
<xml_diff>
--- a/backend/app/templates/invoice_template.docx
+++ b/backend/app/templates/invoice_template.docx
@@ -27,51 +27,7 @@
         </w:rPr>
       </w:pPr>
       <w:r>
-        <w:drawing>
-          <wp:anchor behindDoc="0" distT="0" distB="0" distL="0" distR="0" simplePos="0" locked="0" layoutInCell="0" allowOverlap="1" relativeHeight="2">
-            <wp:simplePos x="0" y="0"/>
-            <wp:positionH relativeFrom="column">
-              <wp:posOffset>3850005</wp:posOffset>
-            </wp:positionH>
-            <wp:positionV relativeFrom="paragraph">
-              <wp:posOffset>26035</wp:posOffset>
-            </wp:positionV>
-            <wp:extent cx="1572260" cy="1325245"/>
-            <wp:effectExtent l="0" t="0" r="0" b="0"/>
-            <wp:wrapSquare wrapText="largest"/>
-            <wp:docPr id="1" name="Immagine1" descr=""/>
-            <wp:cNvGraphicFramePr>
-              <a:graphicFrameLocks xmlns:a="http://schemas.openxmlformats.org/drawingml/2006/main" noChangeAspect="1"/>
-            </wp:cNvGraphicFramePr>
-            <a:graphic xmlns:a="http://schemas.openxmlformats.org/drawingml/2006/main">
-              <a:graphicData uri="http://schemas.openxmlformats.org/drawingml/2006/picture">
-                <pic:pic xmlns:pic="http://schemas.openxmlformats.org/drawingml/2006/picture">
-                  <pic:nvPicPr>
-                    <pic:cNvPr id="1" name="Immagine1" descr=""/>
-                    <pic:cNvPicPr>
-                      <a:picLocks noChangeAspect="1" noChangeArrowheads="1"/>
-                    </pic:cNvPicPr>
-                  </pic:nvPicPr>
-                  <pic:blipFill>
-                    <a:blip r:embed="rId2"/>
-                    <a:stretch>
-                      <a:fillRect/>
-                    </a:stretch>
-                  </pic:blipFill>
-                  <pic:spPr bwMode="auto">
-                    <a:xfrm>
-                      <a:off x="0" y="0"/>
-                      <a:ext cx="1572260" cy="1325245"/>
-                    </a:xfrm>
-                    <a:prstGeom prst="rect">
-                      <a:avLst/>
-                    </a:prstGeom>
-                  </pic:spPr>
-                </pic:pic>
-              </a:graphicData>
-            </a:graphic>
-          </wp:anchor>
-        </w:drawing>
+        <w:t>{{ intestatario_titolo }}</w:t>
       </w:r>
       <w:r>
         <w:rPr>
@@ -79,7 +35,6 @@
           <w:b/>
           <w:bCs/>
         </w:rPr>
-        <w:t>DOTT.SSA ERIKA LUIGIA FENAROLI</w:t>
       </w:r>
     </w:p>
     <w:p>
@@ -98,7 +53,7 @@
           <w:b/>
           <w:bCs/>
         </w:rPr>
-        <w:t>PSICOLOGA</w:t>
+        <w:t>{{ intestatario_professione }}</w:t>
       </w:r>
     </w:p>
     <w:p>
@@ -113,7 +68,7 @@
         <w:rPr>
           <w:rFonts w:ascii="arial" w:hAnsi="arial"/>
         </w:rPr>
-        <w:t>Piazzetta G.L. De Cambray Digny 3</w:t>
+        <w:t>{{ intestatario_indirizzo }}</w:t>
       </w:r>
     </w:p>
     <w:p>
@@ -128,7 +83,7 @@
         <w:rPr>
           <w:rFonts w:ascii="arial" w:hAnsi="arial"/>
         </w:rPr>
-        <w:t>50038 Scarperia e San Piero (FI)</w:t>
+        <w:t>{{ intestatario_cap_citta }}</w:t>
       </w:r>
     </w:p>
     <w:p>
@@ -143,7 +98,7 @@
         <w:rPr>
           <w:rFonts w:ascii="arial" w:hAnsi="arial"/>
         </w:rPr>
-        <w:t>C.F. FNRRLG84A55D286E</w:t>
+        <w:t>C.F. {{ intestatario_cf }}</w:t>
       </w:r>
     </w:p>
     <w:p>
@@ -158,7 +113,7 @@
         <w:rPr>
           <w:rFonts w:ascii="arial" w:hAnsi="arial"/>
         </w:rPr>
-        <w:t>P.I. 07427740480</w:t>
+        <w:t>P.I. {{ intestatario_piva }}</w:t>
       </w:r>
     </w:p>
     <w:p>
@@ -171,14 +126,13 @@
         <w:rPr>
           <w:rFonts w:ascii="arial" w:hAnsi="arial"/>
         </w:rPr>
-        <w:t xml:space="preserve">E-mail: </w:t>
+        <w:t>E-mail: {{ intestatario_email }}</w:t>
       </w:r>
       <w:r>
         <w:rPr>
           <w:rStyle w:val="Hyperlink"/>
           <w:rFonts w:ascii="arial" w:hAnsi="arial"/>
         </w:rPr>
-        <w:t>erika.fenaroli@yahoo.it</w:t>
       </w:r>
     </w:p>
     <w:p>
@@ -191,17 +145,8 @@
         <w:rPr>
           <w:rFonts w:ascii="arial" w:hAnsi="arial"/>
         </w:rPr>
-        <w:t xml:space="preserve">PEC: </w:t>
+        <w:t>PEC: {{ intestatario_pec }}</w:t>
       </w:r>
-      <w:hyperlink r:id="rId3">
-        <w:r>
-          <w:rPr>
-            <w:rStyle w:val="Hyperlink"/>
-            <w:rFonts w:ascii="arial" w:hAnsi="arial"/>
-          </w:rPr>
-          <w:t>erikaluigiafenaroli@psypec.it</w:t>
-        </w:r>
-      </w:hyperlink>
     </w:p>
     <w:p>
       <w:pPr>
@@ -829,7 +774,7 @@
         <w:rPr>
           <w:rFonts w:ascii="arial" w:hAnsi="arial"/>
         </w:rPr>
-        <w:t>Pagato con {{ metodo_pagamento }} in data {{ data_pagamento }}</w:t>
+        <w:t>{{ pagamento_descrizione }}</w:t>
       </w:r>
     </w:p>
     <w:p>
@@ -938,7 +883,7 @@
           <w:i/>
           <w:iCs/>
         </w:rPr>
-        <w:t>Fenaroli Erika Luigia</w:t>
+        <w:t>{{ intestatario_nome }}</w:t>
       </w:r>
     </w:p>
     <w:p>
@@ -954,7 +899,7 @@
         <w:rPr>
           <w:rFonts w:ascii="arial" w:hAnsi="arial"/>
         </w:rPr>
-        <w:t>Piazzetta C.G.L. de Cambray Digny 3 – 50038 (FI)</w:t>
+        <w:t>{{ intestatario_indirizzo }} – {{ intestatario_cap_citta }}</w:t>
       </w:r>
     </w:p>
     <w:p>
@@ -970,7 +915,7 @@
         <w:rPr>
           <w:rFonts w:ascii="arial" w:hAnsi="arial"/>
         </w:rPr>
-        <w:t>C.F.FNRRLG84A55D286E - P.I. 07427740480</w:t>
+        <w:t>C.F. {{ intestatario_cf }} - P.I. {{ intestatario_piva }}</w:t>
       </w:r>
     </w:p>
     <w:sectPr>

</xml_diff>